<commit_message>
auto: XHS cards — 2026-07-19
</commit_message>
<xml_diff>
--- a/docs/xhs/2026-07-18/科技报/发布文案.docx
+++ b/docs/xhs/2026-07-18/科技报/发布文案.docx
@@ -92,7 +92,7 @@
         <w:pStyle w:val="ListBullet"/>
       </w:pPr>
       <w:r>
-        <w:t>Databricks成功重塑为AI公司，估值达到1880亿美元。公司还发布研究，证明开源权重AI模型在编程任务中的成本优势。这一估值里程碑表明，数据基础设施与AI融合的趋势正获得资本市场高度认可。</w:t>
+        <w:t>Databricks成功转型为AI公司，估值飙升至1880亿美元，并发布了关于开源权重AI模型在编码领域成本节约的研究。这标志着其从数据平台向AI基础设施的跨越，对行业格局产生重大影响。</w:t>
       </w:r>
     </w:p>
     <w:p>
@@ -113,7 +113,83 @@
         <w:rPr>
           <w:sz w:val="24"/>
         </w:rPr>
-        <w:t>#2 ★★★★★  苹果起诉OpenAI，可能扰乱其IPO计划</w:t>
+        <w:t>#2 ★★★★★  Kimi发布新版本引发“AI共产主义”担忧</w:t>
+      </w:r>
+    </w:p>
+    <w:p>
+      <w:r>
+        <w:rPr>
+          <w:color w:val="888888"/>
+          <w:sz w:val="18"/>
+        </w:rPr>
+        <w:t>来源: TechCrunch</w:t>
+      </w:r>
+    </w:p>
+    <w:p>
+      <w:pPr>
+        <w:pStyle w:val="ListBullet"/>
+      </w:pPr>
+      <w:r>
+        <w:t>中国公司Moonshot AI发布了Kimi模型的新版本，引发关于“全面AI共产主义”的担忧。该模型在性能上取得突破，可能加剧AI领域的竞争与监管讨论，对全球AI生态产生深远影响。</w:t>
+      </w:r>
+    </w:p>
+    <w:p>
+      <w:r>
+        <w:rPr>
+          <w:color w:val="3366CC"/>
+          <w:sz w:val="18"/>
+        </w:rPr>
+        <w:t>https://techcrunch.com/2026/07/18/kimi-threat-or-menace/</w:t>
+      </w:r>
+    </w:p>
+    <w:p/>
+    <w:p>
+      <w:pPr>
+        <w:pStyle w:val="Heading3"/>
+      </w:pPr>
+      <w:r>
+        <w:rPr>
+          <w:sz w:val="24"/>
+        </w:rPr>
+        <w:t>#3 ★★★★★  Apple和Google被勒令下架“脱衣”应用</w:t>
+      </w:r>
+    </w:p>
+    <w:p>
+      <w:r>
+        <w:rPr>
+          <w:color w:val="888888"/>
+          <w:sz w:val="18"/>
+        </w:rPr>
+        <w:t>来源: TechCrunch</w:t>
+      </w:r>
+    </w:p>
+    <w:p>
+      <w:pPr>
+        <w:pStyle w:val="ListBullet"/>
+      </w:pPr>
+      <w:r>
+        <w:t>旧金山市检察官要求Apple和Google从应用商店中移除“脱衣”应用，称其违反州法律。此举凸显AI生成内容的监管挑战，可能引发更严格的行业合规要求。</w:t>
+      </w:r>
+    </w:p>
+    <w:p>
+      <w:r>
+        <w:rPr>
+          <w:color w:val="3366CC"/>
+          <w:sz w:val="18"/>
+        </w:rPr>
+        <w:t>https://techcrunch.com/2026/07/17/apple-and-google-ordered-to-purge-nudify-apps-from-app-stores/</w:t>
+      </w:r>
+    </w:p>
+    <w:p/>
+    <w:p>
+      <w:pPr>
+        <w:pStyle w:val="Heading3"/>
+      </w:pPr>
+      <w:r>
+        <w:rPr>
+          <w:sz w:val="24"/>
+        </w:rPr>
+        <w:t>#4 ★★★★☆  Dave Eggers警告OpenAI：ChatGPT正在“沉默一代人”</w:t>
       </w:r>
     </w:p>
     <w:p>
@@ -130,7 +206,7 @@
         <w:pStyle w:val="ListBullet"/>
       </w:pPr>
       <w:r>
-        <w:t>苹果以商业秘密侵权为由起诉OpenAI，指控其系统性挖角超过400名前苹果员工，并涉及首席硬件官。该诉讼可能对OpenAI的IPO计划构成重大威胁，反映科技巨头间AI人才与知识产权争夺日趋白热化。</w:t>
+        <w:t>作家Dave Eggers在OpenAI内部演讲中批评ChatGPT可能抑制创意表达，导致一代人失声。这一观点引发对AI影响人类创造力的广泛讨论，对AI伦理和社会责任提出新问题。</w:t>
       </w:r>
     </w:p>
     <w:p>
@@ -139,7 +215,7 @@
           <w:color w:val="3366CC"/>
           <w:sz w:val="18"/>
         </w:rPr>
-        <w:t>https://www.theverge.com/podcast/967244/apple-openai-lawsuit-vergecast</w:t>
+        <w:t>https://www.theverge.com/ai-artificial-intelligence/967630/dave-eggers-openai-chatgpt-silencing-an-entire-generation</w:t>
       </w:r>
     </w:p>
     <w:p/>
@@ -151,7 +227,7 @@
         <w:rPr>
           <w:sz w:val="24"/>
         </w:rPr>
-        <w:t>#3 ★★★★★  Agility Robotics在特斯拉后院开设机器人训练中心</w:t>
+        <w:t>#5 ★★★★☆  Waymo旧金山服务因停电暂停一小时</w:t>
       </w:r>
     </w:p>
     <w:p>
@@ -168,7 +244,45 @@
         <w:pStyle w:val="ListBullet"/>
       </w:pPr>
       <w:r>
-        <w:t>Agility Robotics在加州弗里蒙特开设新的Digit机器人训练中心，该地正是特斯拉总部所在地。此举标志着人形机器人领域的竞争升级，Agility直接挑战特斯拉的Optimus机器人，加速商业化落地进程。</w:t>
+        <w:t>Waymo的自动驾驶出租车服务在旧金山因停电暂停约一小时后恢复。这并非首次因电力问题导致服务中断，凸显自动驾驶运营对基础设施的依赖性。</w:t>
+      </w:r>
+    </w:p>
+    <w:p>
+      <w:r>
+        <w:rPr>
+          <w:color w:val="3366CC"/>
+          <w:sz w:val="18"/>
+        </w:rPr>
+        <w:t>https://techcrunch.com/2026/07/18/waymo-appears-to-pause-san-francisco-service-amidst-power-outage/</w:t>
+      </w:r>
+    </w:p>
+    <w:p/>
+    <w:p>
+      <w:pPr>
+        <w:pStyle w:val="Heading3"/>
+      </w:pPr>
+      <w:r>
+        <w:rPr>
+          <w:sz w:val="24"/>
+        </w:rPr>
+        <w:t>#6 ★★★★☆  Agility Robotics在特斯拉后院开设机器人训练中心</w:t>
+      </w:r>
+    </w:p>
+    <w:p>
+      <w:r>
+        <w:rPr>
+          <w:color w:val="888888"/>
+          <w:sz w:val="18"/>
+        </w:rPr>
+        <w:t>来源: TechCrunch</w:t>
+      </w:r>
+    </w:p>
+    <w:p>
+      <w:pPr>
+        <w:pStyle w:val="ListBullet"/>
+      </w:pPr>
+      <w:r>
+        <w:t>Agility Robotics在加州弗里蒙特开设新的Digit机器人训练中心，直接与特斯拉竞争。此举标志着人形机器人商业化加速，可能重塑制造业和物流业。</w:t>
       </w:r>
     </w:p>
     <w:p>
@@ -189,7 +303,7 @@
         <w:rPr>
           <w:sz w:val="24"/>
         </w:rPr>
-        <w:t>#4 ★★★★★  阶跃星辰发布首款智能体手机，AI走出屏幕</w:t>
+        <w:t>#7 ★★★★☆  阶跃星辰在WAIC展示智能体手机和机器人</w:t>
       </w:r>
     </w:p>
     <w:p>
@@ -206,7 +320,7 @@
         <w:pStyle w:val="ListBullet"/>
       </w:pPr>
       <w:r>
-        <w:t>阶跃星辰在WAIC 2026上推出全球首款智能体手机，将AI从虚拟屏幕带入物理世界。该设备旨在实现人机共生的新交互范式，代表大模型落地硬件的重大突破，可能重塑智能手机行业格局。</w:t>
+        <w:t>阶跃星辰在WAIC 2026上发布首款智能体手机，并展示6台机器人拼长城的场景，将AI从屏幕带入现实世界。这体现了AI从大模型向具身智能的转变趋势。</w:t>
       </w:r>
     </w:p>
     <w:p>
@@ -215,7 +329,7 @@
           <w:color w:val="3366CC"/>
           <w:sz w:val="18"/>
         </w:rPr>
-        <w:t>https://www.ifanr.com/1672281?utm_source=rss&amp;utm_medium=rss&amp;utm_campaign=</w:t>
+        <w:t>https://www.ifanr.com/1672344?utm_source=rss&amp;utm_medium=rss&amp;utm_campaign=</w:t>
       </w:r>
     </w:p>
     <w:p/>
@@ -227,7 +341,7 @@
         <w:rPr>
           <w:sz w:val="24"/>
         </w:rPr>
-        <w:t>#5 ★★★★☆  Patreon联合Cloudflare主动屏蔽AI爬虫</w:t>
+        <w:t>#8 ★★★★☆  NVIDIA与Hugging Face合作大规模微调视频和图像模型</w:t>
       </w:r>
     </w:p>
     <w:p>
@@ -236,7 +350,7 @@
           <w:color w:val="888888"/>
           <w:sz w:val="18"/>
         </w:rPr>
-        <w:t>来源: TechCrunch</w:t>
+        <w:t>来源: Hugging Face</w:t>
       </w:r>
     </w:p>
     <w:p>
@@ -244,159 +358,7 @@
         <w:pStyle w:val="ListBullet"/>
       </w:pPr>
       <w:r>
-        <w:t>Patreon放弃仅依赖robots.txt的被动防御，与Cloudflare合作主动阻止AI模型未经授权抓取创作者内容。此举标志着内容平台对AI训练数据采集的立场从请求转向强制，可能引发行业效仿。</w:t>
-      </w:r>
-    </w:p>
-    <w:p>
-      <w:r>
-        <w:rPr>
-          <w:color w:val="3366CC"/>
-          <w:sz w:val="18"/>
-        </w:rPr>
-        <w:t>https://techcrunch.com/2026/07/17/patreon-stops-asking-ai-bots-not-to-scrape-and-starts-blocking-them/</w:t>
-      </w:r>
-    </w:p>
-    <w:p/>
-    <w:p>
-      <w:pPr>
-        <w:pStyle w:val="Heading3"/>
-      </w:pPr>
-      <w:r>
-        <w:rPr>
-          <w:sz w:val="24"/>
-        </w:rPr>
-        <w:t>#6 ★★★★☆  TikTok测试AI肖像检测工具</w:t>
-      </w:r>
-    </w:p>
-    <w:p>
-      <w:r>
-        <w:rPr>
-          <w:color w:val="888888"/>
-          <w:sz w:val="18"/>
-        </w:rPr>
-        <w:t>来源: The Verge</w:t>
-      </w:r>
-    </w:p>
-    <w:p>
-      <w:pPr>
-        <w:pStyle w:val="ListBullet"/>
-      </w:pPr>
-      <w:r>
-        <w:t>TikTok开始测试一项可选工具，能扫描并让创作者举报未经授权的AI肖像生成。该功能目前面向部分美国创作者开放，与YouTube等平台的类似举措相呼应，反映社交平台正加强对AI深度伪造的治理。</w:t>
-      </w:r>
-    </w:p>
-    <w:p>
-      <w:r>
-        <w:rPr>
-          <w:color w:val="3366CC"/>
-          <w:sz w:val="18"/>
-        </w:rPr>
-        <w:t>https://www.theverge.com/tech/967486/tiktok-ai-likeness-detection-tool</w:t>
-      </w:r>
-    </w:p>
-    <w:p/>
-    <w:p>
-      <w:pPr>
-        <w:pStyle w:val="Heading3"/>
-      </w:pPr>
-      <w:r>
-        <w:rPr>
-          <w:sz w:val="24"/>
-        </w:rPr>
-        <w:t>#7 ★★★★☆  AI内存短缺冲击印度智能手机市场</w:t>
-      </w:r>
-    </w:p>
-    <w:p>
-      <w:r>
-        <w:rPr>
-          <w:color w:val="888888"/>
-          <w:sz w:val="18"/>
-        </w:rPr>
-        <w:t>来源: TechCrunch</w:t>
-      </w:r>
-    </w:p>
-    <w:p>
-      <w:pPr>
-        <w:pStyle w:val="ListBullet"/>
-      </w:pPr>
-      <w:r>
-        <w:t>AI热潮导致的内存短缺正深刻影响印度智能手机市场，从定价、需求到企业战略均受波及。这一趋势表明，AI对硬件资源的争夺已从云端延伸到消费电子领域，可能重塑全球手机产业链。</w:t>
-      </w:r>
-    </w:p>
-    <w:p>
-      <w:r>
-        <w:rPr>
-          <w:color w:val="3366CC"/>
-          <w:sz w:val="18"/>
-        </w:rPr>
-        <w:t>https://techcrunch.com/2026/07/17/ai-driven-memory-crunch-jolts-indias-smartphone-market/</w:t>
-      </w:r>
-    </w:p>
-    <w:p/>
-    <w:p>
-      <w:pPr>
-        <w:pStyle w:val="Heading3"/>
-      </w:pPr>
-      <w:r>
-        <w:rPr>
-          <w:sz w:val="24"/>
-        </w:rPr>
-        <w:t>#8 ★★★★☆  旧金山命令苹果谷歌清除App Store中的‘脱衣’应用</w:t>
-      </w:r>
-    </w:p>
-    <w:p>
-      <w:r>
-        <w:rPr>
-          <w:color w:val="888888"/>
-          <w:sz w:val="18"/>
-        </w:rPr>
-        <w:t>来源: TechCrunch</w:t>
-      </w:r>
-    </w:p>
-    <w:p>
-      <w:pPr>
-        <w:pStyle w:val="ListBullet"/>
-      </w:pPr>
-      <w:r>
-        <w:t>旧金山市检察官致函苹果和谷歌，要求其从应用商店中移除违反州法律的‘脱衣’AI应用。此举凸显监管机构对AI生成不当内容的打击力度加大，可能推动应用商店审核标准的进一步收紧。</w:t>
-      </w:r>
-    </w:p>
-    <w:p>
-      <w:r>
-        <w:rPr>
-          <w:color w:val="3366CC"/>
-          <w:sz w:val="18"/>
-        </w:rPr>
-        <w:t>https://techcrunch.com/2026/07/17/apple-and-google-ordered-to-purge-nudify-apps-from-app-stores/</w:t>
-      </w:r>
-    </w:p>
-    <w:p/>
-    <w:p>
-      <w:pPr>
-        <w:pStyle w:val="Heading3"/>
-      </w:pPr>
-      <w:r>
-        <w:rPr>
-          <w:sz w:val="24"/>
-        </w:rPr>
-        <w:t>#9 ★★★★☆  Hugging Face与NVIDIA推出大规模视频/图像模型微调方案</w:t>
-      </w:r>
-    </w:p>
-    <w:p>
-      <w:r>
-        <w:rPr>
-          <w:color w:val="888888"/>
-          <w:sz w:val="18"/>
-        </w:rPr>
-        <w:t>来源: Hugging Face - Blog</w:t>
-      </w:r>
-    </w:p>
-    <w:p>
-      <w:pPr>
-        <w:pStyle w:val="ListBullet"/>
-      </w:pPr>
-      <w:r>
-        <w:t>Hugging Face与NVIDIA合作，推出基于NeMo Automodel和🤗 Diffusers的大规模视频与图像模型微调方案。该技术显著降低了多模态模型训练门槛，为企业和开发者提供了更高效的定制化AI模型生产路径。</w:t>
+        <w:t>NVIDIA与Hugging Face合作，通过NeMo Automodel和Diffusers实现视频和图像模型的大规模微调。此举降低了AI模型定制门槛，推动企业级应用发展。</w:t>
       </w:r>
     </w:p>
     <w:p>
@@ -417,7 +379,7 @@
         <w:rPr>
           <w:sz w:val="24"/>
         </w:rPr>
-        <w:t>#10 ★★★★☆  Hugging Face披露安全事件</w:t>
+        <w:t>#9 ★★★★☆  Hugging Face披露安全事件</w:t>
       </w:r>
     </w:p>
     <w:p>
@@ -426,7 +388,7 @@
           <w:color w:val="888888"/>
           <w:sz w:val="18"/>
         </w:rPr>
-        <w:t>来源: Hugging Face - Blog</w:t>
+        <w:t>来源: Hugging Face</w:t>
       </w:r>
     </w:p>
     <w:p>
@@ -434,7 +396,7 @@
         <w:pStyle w:val="ListBullet"/>
       </w:pPr>
       <w:r>
-        <w:t>Hugging Face发布2026年7月安全事件披露公告，承认遭遇安全漏洞。作为全球最大的AI模型托管平台，此次事件可能影响数百万用户的模型和数据安全，引发业界对AI基础设施安全性的广泛关注。</w:t>
+        <w:t>Hugging Face披露了2026年7月的安全事件，但未提供具体细节。作为AI模型托管平台，其安全漏洞可能影响大量用户和模型，引发行业对AI供应链安全的关注。</w:t>
       </w:r>
     </w:p>
     <w:p>
@@ -444,6 +406,44 @@
           <w:sz w:val="18"/>
         </w:rPr>
         <w:t>https://huggingface.co/blog/security-incident-july-2026</w:t>
+      </w:r>
+    </w:p>
+    <w:p/>
+    <w:p>
+      <w:pPr>
+        <w:pStyle w:val="Heading3"/>
+      </w:pPr>
+      <w:r>
+        <w:rPr>
+          <w:sz w:val="24"/>
+        </w:rPr>
+        <w:t>#10 ★★★☆☆  AI驱动内存短缺冲击印度智能手机市场</w:t>
+      </w:r>
+    </w:p>
+    <w:p>
+      <w:r>
+        <w:rPr>
+          <w:color w:val="888888"/>
+          <w:sz w:val="18"/>
+        </w:rPr>
+        <w:t>来源: TechCrunch</w:t>
+      </w:r>
+    </w:p>
+    <w:p>
+      <w:pPr>
+        <w:pStyle w:val="ListBullet"/>
+      </w:pPr>
+      <w:r>
+        <w:t>AI热潮导致内存需求激增，冲击印度智能手机市场，影响定价、需求和企业战略。这反映了AI对消费电子行业的深远影响，可能引发全球供应链调整。</w:t>
+      </w:r>
+    </w:p>
+    <w:p>
+      <w:r>
+        <w:rPr>
+          <w:color w:val="3366CC"/>
+          <w:sz w:val="18"/>
+        </w:rPr>
+        <w:t>https://techcrunch.com/2026/07/17/ai-driven-memory-crunch-jolts-indias-smartphone-market/</w:t>
       </w:r>
     </w:p>
     <w:p/>

</xml_diff>